<commit_message>
App R update and extra logbook
Added extra function to App.R and put UCell module in comments, since it does not work correctly
</commit_message>
<xml_diff>
--- a/Logbook 26-08-2026.docx
+++ b/Logbook 26-08-2026.docx
@@ -7,14 +7,12 @@
         <w:rPr>
           <w:b/>
           <w:sz w:val="32"/>
-          <w:lang w:val="en-BE"/>
         </w:rPr>
       </w:pPr>
       <w:r>
         <w:rPr>
           <w:b/>
           <w:sz w:val="32"/>
-          <w:lang w:val="en-BE"/>
         </w:rPr>
         <w:t>Logbook 26/08/2026</w:t>
       </w:r>
@@ -28,13 +26,11 @@
         </w:numPr>
         <w:rPr>
           <w:sz w:val="24"/>
-          <w:lang w:val="en-BE"/>
-        </w:rPr>
-      </w:pPr>
-      <w:r>
-        <w:rPr>
-          <w:sz w:val="24"/>
-          <w:lang w:val="en-BE"/>
+        </w:rPr>
+      </w:pPr>
+      <w:r>
+        <w:rPr>
+          <w:sz w:val="24"/>
         </w:rPr>
         <w:t>Fixed manual input of the GSEA</w:t>
       </w:r>
@@ -48,13 +44,11 @@
         </w:numPr>
         <w:rPr>
           <w:sz w:val="24"/>
-          <w:lang w:val="en-BE"/>
-        </w:rPr>
-      </w:pPr>
-      <w:r>
-        <w:rPr>
-          <w:sz w:val="24"/>
-          <w:lang w:val="en-BE"/>
+        </w:rPr>
+      </w:pPr>
+      <w:r>
+        <w:rPr>
+          <w:sz w:val="24"/>
         </w:rPr>
         <w:t>Nothing wrong with ORA</w:t>
       </w:r>
@@ -68,13 +62,11 @@
         </w:numPr>
         <w:rPr>
           <w:sz w:val="24"/>
-          <w:lang w:val="en-BE"/>
-        </w:rPr>
-      </w:pPr>
-      <w:r>
-        <w:rPr>
-          <w:sz w:val="24"/>
-          <w:lang w:val="en-BE"/>
+        </w:rPr>
+      </w:pPr>
+      <w:r>
+        <w:rPr>
+          <w:sz w:val="24"/>
         </w:rPr>
         <w:t xml:space="preserve">Made the </w:t>
       </w:r>
@@ -82,7 +74,6 @@
       <w:r>
         <w:rPr>
           <w:sz w:val="24"/>
-          <w:lang w:val="en-BE"/>
         </w:rPr>
         <w:t>UCell</w:t>
       </w:r>
@@ -90,7 +81,6 @@
       <w:r>
         <w:rPr>
           <w:sz w:val="24"/>
-          <w:lang w:val="en-BE"/>
         </w:rPr>
         <w:t xml:space="preserve"> tab, and I am testing it (no output yet)</w:t>
       </w:r>
@@ -104,7 +94,6 @@
         </w:numPr>
         <w:rPr>
           <w:sz w:val="24"/>
-          <w:lang w:val="en-BE"/>
         </w:rPr>
       </w:pPr>
       <w:r>
@@ -170,14 +159,12 @@
         </w:numPr>
         <w:rPr>
           <w:sz w:val="24"/>
-          <w:lang w:val="en-BE"/>
         </w:rPr>
       </w:pPr>
       <w:proofErr w:type="spellStart"/>
       <w:r>
         <w:rPr>
           <w:sz w:val="24"/>
-          <w:lang w:val="en-BE"/>
         </w:rPr>
         <w:t>Aatf</w:t>
       </w:r>
@@ -185,14 +172,12 @@
       <w:r>
         <w:rPr>
           <w:sz w:val="24"/>
-          <w:lang w:val="en-BE"/>
         </w:rPr>
         <w:t xml:space="preserve"> (separate scoring</w:t>
       </w:r>
       <w:r>
         <w:rPr>
           <w:sz w:val="24"/>
-          <w:lang w:val="en-BE"/>
         </w:rPr>
         <w:t xml:space="preserve"> per TF, but only </w:t>
       </w:r>
@@ -200,7 +185,6 @@
       <w:r>
         <w:rPr>
           <w:sz w:val="24"/>
-          <w:lang w:val="en-BE"/>
         </w:rPr>
         <w:t>Aatf</w:t>
       </w:r>
@@ -208,7 +192,6 @@
       <w:r>
         <w:rPr>
           <w:sz w:val="24"/>
-          <w:lang w:val="en-BE"/>
         </w:rPr>
         <w:t>)</w:t>
       </w:r>
@@ -222,20 +205,17 @@
         </w:numPr>
         <w:rPr>
           <w:sz w:val="24"/>
-          <w:lang w:val="en-BE"/>
-        </w:rPr>
-      </w:pPr>
-      <w:r>
-        <w:rPr>
-          <w:sz w:val="24"/>
-          <w:lang w:val="en-BE"/>
+        </w:rPr>
+      </w:pPr>
+      <w:r>
+        <w:rPr>
+          <w:sz w:val="24"/>
         </w:rPr>
         <w:t xml:space="preserve">Scoring with precomputed ranks for 4 genes: </w:t>
       </w:r>
       <w:r>
         <w:rPr>
           <w:sz w:val="24"/>
-          <w:lang w:val="en-BE"/>
         </w:rPr>
         <w:t>Serial scoring (cached ranks, clean script): 790.5 sec</w:t>
       </w:r>
@@ -249,31 +229,92 @@
         </w:numPr>
         <w:rPr>
           <w:sz w:val="24"/>
+        </w:rPr>
+      </w:pPr>
+      <w:r>
+        <w:rPr>
+          <w:sz w:val="24"/>
+        </w:rPr>
+        <w:t xml:space="preserve">Scoring without precomputed ranks, using data layer, for same 4 genes: </w:t>
+      </w:r>
+      <w:r>
+        <w:rPr>
+          <w:sz w:val="24"/>
           <w:lang w:val="en-BE"/>
         </w:rPr>
+        <w:t>/</w:t>
+      </w:r>
+    </w:p>
+    <w:p>
+      <w:pPr>
+        <w:pStyle w:val="ListParagraph"/>
+        <w:numPr>
+          <w:ilvl w:val="0"/>
+          <w:numId w:val="4"/>
+        </w:numPr>
+        <w:rPr>
+          <w:sz w:val="24"/>
+        </w:rPr>
       </w:pPr>
       <w:r>
         <w:rPr>
           <w:sz w:val="24"/>
           <w:lang w:val="en-BE"/>
         </w:rPr>
-        <w:t>Scoring without precomputed ranks, using da</w:t>
+        <w:t>For 1000 cells and rank 200: 5,5s</w:t>
+      </w:r>
+    </w:p>
+    <w:p>
+      <w:pPr>
+        <w:pStyle w:val="ListParagraph"/>
+        <w:numPr>
+          <w:ilvl w:val="0"/>
+          <w:numId w:val="4"/>
+        </w:numPr>
+        <w:rPr>
+          <w:sz w:val="24"/>
+        </w:rPr>
+      </w:pPr>
+      <w:r>
+        <w:rPr>
+          <w:sz w:val="24"/>
+          <w:lang w:val="en-BE"/>
+        </w:rPr>
+        <w:t xml:space="preserve">For 1000 cells and rank </w:t>
+      </w:r>
+      <w:r>
+        <w:rPr>
+          <w:sz w:val="24"/>
+          <w:lang w:val="en-BE"/>
+        </w:rPr>
+        <w:t>1500</w:t>
+      </w:r>
+      <w:r>
+        <w:rPr>
+          <w:sz w:val="24"/>
+          <w:lang w:val="en-BE"/>
+        </w:rPr>
+        <w:t xml:space="preserve">: </w:t>
+      </w:r>
+      <w:r>
+        <w:rPr>
+          <w:sz w:val="24"/>
+          <w:lang w:val="en-BE"/>
+        </w:rPr>
+        <w:t>6,2s</w:t>
       </w:r>
       <w:bookmarkStart w:id="0" w:name="_GoBack"/>
       <w:bookmarkEnd w:id="0"/>
-      <w:r>
-        <w:rPr>
-          <w:sz w:val="24"/>
-          <w:lang w:val="en-BE"/>
-        </w:rPr>
-        <w:t xml:space="preserve">ta layer, for same 4 genes: </w:t>
-      </w:r>
     </w:p>
     <w:p>
       <w:pPr>
-        <w:rPr>
-          <w:sz w:val="24"/>
-          <w:lang w:val="en-BE"/>
+        <w:pStyle w:val="ListParagraph"/>
+        <w:numPr>
+          <w:ilvl w:val="0"/>
+          <w:numId w:val="4"/>
+        </w:numPr>
+        <w:rPr>
+          <w:sz w:val="24"/>
         </w:rPr>
       </w:pPr>
     </w:p>
@@ -281,13 +322,18 @@
       <w:pPr>
         <w:rPr>
           <w:sz w:val="24"/>
-          <w:lang w:val="en-BE"/>
-        </w:rPr>
-      </w:pPr>
-      <w:r>
-        <w:rPr>
-          <w:sz w:val="24"/>
-          <w:lang w:val="en-BE"/>
+        </w:rPr>
+      </w:pPr>
+    </w:p>
+    <w:p>
+      <w:pPr>
+        <w:rPr>
+          <w:sz w:val="24"/>
+        </w:rPr>
+      </w:pPr>
+      <w:r>
+        <w:rPr>
+          <w:sz w:val="24"/>
         </w:rPr>
         <w:t>TODO:</w:t>
       </w:r>
@@ -301,13 +347,11 @@
         </w:numPr>
         <w:rPr>
           <w:sz w:val="24"/>
-          <w:lang w:val="en-BE"/>
-        </w:rPr>
-      </w:pPr>
-      <w:r>
-        <w:rPr>
-          <w:sz w:val="24"/>
-          <w:lang w:val="en-BE"/>
+        </w:rPr>
+      </w:pPr>
+      <w:r>
+        <w:rPr>
+          <w:sz w:val="24"/>
         </w:rPr>
         <w:t>Manual setting GSEA</w:t>
       </w:r>
@@ -321,14 +365,12 @@
         </w:numPr>
         <w:rPr>
           <w:sz w:val="24"/>
-          <w:lang w:val="en-BE"/>
         </w:rPr>
       </w:pPr>
       <w:proofErr w:type="spellStart"/>
       <w:r>
         <w:rPr>
           <w:sz w:val="24"/>
-          <w:lang w:val="en-BE"/>
         </w:rPr>
         <w:t>UCell</w:t>
       </w:r>
@@ -336,7 +378,6 @@
       <w:r>
         <w:rPr>
           <w:sz w:val="24"/>
-          <w:lang w:val="en-BE"/>
         </w:rPr>
         <w:t xml:space="preserve"> tab</w:t>
       </w:r>
@@ -350,13 +391,11 @@
         </w:numPr>
         <w:rPr>
           <w:sz w:val="24"/>
-          <w:lang w:val="en-BE"/>
-        </w:rPr>
-      </w:pPr>
-      <w:r>
-        <w:rPr>
-          <w:sz w:val="24"/>
-          <w:lang w:val="en-BE"/>
+        </w:rPr>
+      </w:pPr>
+      <w:r>
+        <w:rPr>
+          <w:sz w:val="24"/>
         </w:rPr>
         <w:t>ORA verification</w:t>
       </w:r>

</xml_diff>